<commit_message>
Machine-learning land cover of Kampala valley floors 1986-2025 (LightGBM); added to Papers 1 and 2, sponge Substack, GIF
Co-Authored-By: Claude Opus 5.5 <noreply@anthropic.com>
</commit_message>
<xml_diff>
--- a/paper/kampala_bay_paper2.docx
+++ b/paper/kampala_bay_paper2.docx
@@ -1463,7 +1463,7 @@
         <w:pStyle w:val="BodyText"/>
       </w:pPr>
       <w:r>
-        <w:t xml:space="preserve">The share of valley floor still vegetated fell from 90% to 44% (Fig. kd43a). The loss is steady across four decades and has not slowed.</w:t>
+        <w:t xml:space="preserve">The share of valley floor still vegetated fell from 90% to 44% (Fig. kd43a). The loss is steady across four decades and has not slowed. A machine-learning land-cover map (LightGBM trained on agreed WorldCover and Impact Observatory labels; 81% accuracy when trained on 2025 and tested on 2015; Paper 1, Section 3.4) gives the same picture: natural vegetation (wetland plus trees and shrubs) on these valley floors fell from 863 to 384 ha (−56%), and the built and bare share rose from 11% to 56%. Kinawataka is the extreme case, at 3% built in 1986 and 75% in 2025. Two independent methods agree on a loss of about half.</w:t>
       </w:r>
     </w:p>
     <w:p>
@@ -2870,6 +2870,34 @@
       </w:r>
       <w:r>
         <w:t xml:space="preserve">216, 586–597.</w:t>
+      </w:r>
+    </w:p>
+    <w:p>
+      <w:pPr>
+        <w:pStyle w:val="Compact"/>
+        <w:numPr>
+          <w:ilvl w:val="0"/>
+          <w:numId w:val="1011"/>
+        </w:numPr>
+      </w:pPr>
+      <w:r>
+        <w:t xml:space="preserve">Ke, G. et al. (2017). LightGBM: a highly efficient gradient boosting decision tree.</w:t>
+      </w:r>
+      <w:r>
+        <w:t xml:space="preserve"> </w:t>
+      </w:r>
+      <w:r>
+        <w:rPr>
+          <w:i/>
+          <w:iCs/>
+        </w:rPr>
+        <w:t xml:space="preserve">Advances in Neural Information Processing Systems</w:t>
+      </w:r>
+      <w:r>
+        <w:t xml:space="preserve"> </w:t>
+      </w:r>
+      <w:r>
+        <w:t xml:space="preserve">30, 3146–3154.</w:t>
       </w:r>
     </w:p>
     <w:p>

</xml_diff>